<commit_message>
Update project overview document
</commit_message>
<xml_diff>
--- a/DermAI_Diagnostics_Project_Overview.docx
+++ b/DermAI_Diagnostics_Project_Overview.docx
@@ -530,93 +530,6 @@
           <w:sz w:val="22"/>
           <w:szCs w:val="22"/>
         </w:rPr>
-        <w:t>SQL Query Highlights</w:t>
-      </w:r>
-    </w:p>
-    <w:p>
-      <w:pPr>
-        <w:rPr>
-          <w:rFonts w:ascii="Calibri" w:hAnsi="Calibri" w:cs="Calibri"/>
-          <w:sz w:val="22"/>
-          <w:szCs w:val="22"/>
-        </w:rPr>
-      </w:pPr>
-      <w:r>
-        <w:rPr>
-          <w:rFonts w:ascii="Calibri" w:hAnsi="Calibri" w:cs="Calibri"/>
-          <w:sz w:val="22"/>
-          <w:szCs w:val="22"/>
-        </w:rPr>
-        <w:t>The query screenshot</w:t>
-      </w:r>
-      <w:r>
-        <w:rPr>
-          <w:rFonts w:ascii="Calibri" w:hAnsi="Calibri" w:cs="Calibri"/>
-          <w:sz w:val="22"/>
-          <w:szCs w:val="22"/>
-        </w:rPr>
-        <w:t xml:space="preserve"> image</w:t>
-      </w:r>
-      <w:r>
-        <w:rPr>
-          <w:rFonts w:ascii="Calibri" w:hAnsi="Calibri" w:cs="Calibri"/>
-          <w:sz w:val="22"/>
-          <w:szCs w:val="22"/>
-        </w:rPr>
-        <w:t xml:space="preserve">s </w:t>
-      </w:r>
-      <w:r>
-        <w:rPr>
-          <w:rFonts w:ascii="Calibri" w:hAnsi="Calibri" w:cs="Calibri"/>
-          <w:sz w:val="22"/>
-          <w:szCs w:val="22"/>
-        </w:rPr>
-        <w:t xml:space="preserve">uploaded </w:t>
-      </w:r>
-      <w:r>
-        <w:rPr>
-          <w:rFonts w:ascii="Calibri" w:hAnsi="Calibri" w:cs="Calibri"/>
-          <w:sz w:val="22"/>
-          <w:szCs w:val="22"/>
-        </w:rPr>
-        <w:t>highlight key parts of the SQL workflow used in this project, including table joins, validation checks, exploratory analysis, and preparation of a machine-learning-ready dataset.</w:t>
-      </w:r>
-    </w:p>
-    <w:p>
-      <w:pPr>
-        <w:rPr>
-          <w:rFonts w:ascii="Calibri" w:hAnsi="Calibri" w:cs="Calibri"/>
-          <w:sz w:val="22"/>
-          <w:szCs w:val="22"/>
-        </w:rPr>
-      </w:pPr>
-      <w:r>
-        <w:rPr>
-          <w:rFonts w:ascii="Calibri" w:hAnsi="Calibri" w:cs="Calibri"/>
-          <w:sz w:val="22"/>
-          <w:szCs w:val="22"/>
-        </w:rPr>
-        <w:t>They show how I used SQL to work with relational health data, identify clinically relevant patterns, and prepare structured outputs for downstream analysis.</w:t>
-      </w:r>
-    </w:p>
-    <w:p>
-      <w:pPr>
-        <w:rPr>
-          <w:rFonts w:ascii="Calibri" w:hAnsi="Calibri" w:cs="Calibri"/>
-          <w:b/>
-          <w:bCs/>
-          <w:sz w:val="22"/>
-          <w:szCs w:val="22"/>
-        </w:rPr>
-      </w:pPr>
-      <w:r>
-        <w:rPr>
-          <w:rFonts w:ascii="Calibri" w:hAnsi="Calibri" w:cs="Calibri"/>
-          <w:b/>
-          <w:bCs/>
-          <w:sz w:val="22"/>
-          <w:szCs w:val="22"/>
-        </w:rPr>
         <w:t>Key Insights</w:t>
       </w:r>
     </w:p>
@@ -828,334 +741,6 @@
           <w:szCs w:val="22"/>
         </w:rPr>
         <w:t>Preserve and extend the final integrated SQL dataset as the foundation for future classification, risk prediction, and early detection modeling</w:t>
-      </w:r>
-    </w:p>
-    <w:p>
-      <w:pPr>
-        <w:rPr>
-          <w:rFonts w:ascii="Calibri" w:hAnsi="Calibri" w:cs="Calibri"/>
-          <w:b/>
-          <w:bCs/>
-          <w:sz w:val="22"/>
-          <w:szCs w:val="22"/>
-        </w:rPr>
-      </w:pPr>
-      <w:r>
-        <w:rPr>
-          <w:rFonts w:ascii="Calibri" w:hAnsi="Calibri" w:cs="Calibri"/>
-          <w:b/>
-          <w:bCs/>
-          <w:sz w:val="22"/>
-          <w:szCs w:val="22"/>
-        </w:rPr>
-        <w:t>Files Included</w:t>
-      </w:r>
-    </w:p>
-    <w:p>
-      <w:pPr>
-        <w:numPr>
-          <w:ilvl w:val="0"/>
-          <w:numId w:val="6"/>
-        </w:numPr>
-        <w:rPr>
-          <w:rFonts w:ascii="Calibri" w:hAnsi="Calibri" w:cs="Calibri"/>
-          <w:sz w:val="22"/>
-          <w:szCs w:val="22"/>
-        </w:rPr>
-      </w:pPr>
-      <w:r>
-        <w:rPr>
-          <w:rFonts w:ascii="Calibri" w:hAnsi="Calibri" w:cs="Calibri"/>
-          <w:sz w:val="22"/>
-          <w:szCs w:val="22"/>
-        </w:rPr>
-        <w:t>SQL-queries-image-1</w:t>
-      </w:r>
-      <w:r>
-        <w:rPr>
-          <w:rFonts w:ascii="Calibri" w:hAnsi="Calibri" w:cs="Calibri"/>
-          <w:sz w:val="22"/>
-          <w:szCs w:val="22"/>
-        </w:rPr>
-        <w:t>.jpg</w:t>
-      </w:r>
-    </w:p>
-    <w:p>
-      <w:pPr>
-        <w:numPr>
-          <w:ilvl w:val="0"/>
-          <w:numId w:val="6"/>
-        </w:numPr>
-        <w:rPr>
-          <w:rFonts w:ascii="Calibri" w:hAnsi="Calibri" w:cs="Calibri"/>
-          <w:sz w:val="22"/>
-          <w:szCs w:val="22"/>
-        </w:rPr>
-      </w:pPr>
-      <w:r>
-        <w:rPr>
-          <w:rFonts w:ascii="Calibri" w:hAnsi="Calibri" w:cs="Calibri"/>
-          <w:sz w:val="22"/>
-          <w:szCs w:val="22"/>
-        </w:rPr>
-        <w:lastRenderedPageBreak/>
-        <w:t>SQL-queries-image-</w:t>
-      </w:r>
-      <w:r>
-        <w:rPr>
-          <w:rFonts w:ascii="Calibri" w:hAnsi="Calibri" w:cs="Calibri"/>
-          <w:sz w:val="22"/>
-          <w:szCs w:val="22"/>
-        </w:rPr>
-        <w:t>2.</w:t>
-      </w:r>
-      <w:r>
-        <w:rPr>
-          <w:rFonts w:ascii="Calibri" w:hAnsi="Calibri" w:cs="Calibri"/>
-          <w:sz w:val="22"/>
-          <w:szCs w:val="22"/>
-        </w:rPr>
-        <w:t>jpg</w:t>
-      </w:r>
-    </w:p>
-    <w:p>
-      <w:pPr>
-        <w:numPr>
-          <w:ilvl w:val="0"/>
-          <w:numId w:val="6"/>
-        </w:numPr>
-        <w:rPr>
-          <w:rFonts w:ascii="Calibri" w:hAnsi="Calibri" w:cs="Calibri"/>
-          <w:sz w:val="22"/>
-          <w:szCs w:val="22"/>
-        </w:rPr>
-      </w:pPr>
-      <w:r>
-        <w:rPr>
-          <w:rFonts w:ascii="Calibri" w:hAnsi="Calibri" w:cs="Calibri"/>
-          <w:sz w:val="22"/>
-          <w:szCs w:val="22"/>
-        </w:rPr>
-        <w:t>SQL-queries-image-</w:t>
-      </w:r>
-      <w:r>
-        <w:rPr>
-          <w:rFonts w:ascii="Calibri" w:hAnsi="Calibri" w:cs="Calibri"/>
-          <w:sz w:val="22"/>
-          <w:szCs w:val="22"/>
-        </w:rPr>
-        <w:t>3.jpg</w:t>
-      </w:r>
-    </w:p>
-    <w:p>
-      <w:pPr>
-        <w:numPr>
-          <w:ilvl w:val="0"/>
-          <w:numId w:val="6"/>
-        </w:numPr>
-        <w:rPr>
-          <w:rFonts w:ascii="Calibri" w:hAnsi="Calibri" w:cs="Calibri"/>
-          <w:sz w:val="22"/>
-          <w:szCs w:val="22"/>
-        </w:rPr>
-      </w:pPr>
-      <w:r>
-        <w:rPr>
-          <w:rFonts w:ascii="Calibri" w:hAnsi="Calibri" w:cs="Calibri"/>
-          <w:sz w:val="22"/>
-          <w:szCs w:val="22"/>
-        </w:rPr>
-        <w:t>SQL-queries-image-</w:t>
-      </w:r>
-      <w:r>
-        <w:rPr>
-          <w:rFonts w:ascii="Calibri" w:hAnsi="Calibri" w:cs="Calibri"/>
-          <w:sz w:val="22"/>
-          <w:szCs w:val="22"/>
-        </w:rPr>
-        <w:t>4.jpg</w:t>
-      </w:r>
-    </w:p>
-    <w:p>
-      <w:pPr>
-        <w:numPr>
-          <w:ilvl w:val="0"/>
-          <w:numId w:val="6"/>
-        </w:numPr>
-        <w:rPr>
-          <w:rFonts w:ascii="Calibri" w:hAnsi="Calibri" w:cs="Calibri"/>
-          <w:sz w:val="22"/>
-          <w:szCs w:val="22"/>
-        </w:rPr>
-      </w:pPr>
-      <w:r>
-        <w:rPr>
-          <w:rFonts w:ascii="Calibri" w:hAnsi="Calibri" w:cs="Calibri"/>
-          <w:sz w:val="22"/>
-          <w:szCs w:val="22"/>
-        </w:rPr>
-        <w:t>SQL-queries-image-</w:t>
-      </w:r>
-      <w:r>
-        <w:rPr>
-          <w:rFonts w:ascii="Calibri" w:hAnsi="Calibri" w:cs="Calibri"/>
-          <w:sz w:val="22"/>
-          <w:szCs w:val="22"/>
-        </w:rPr>
-        <w:t>5.jpg</w:t>
-      </w:r>
-    </w:p>
-    <w:p>
-      <w:pPr>
-        <w:numPr>
-          <w:ilvl w:val="0"/>
-          <w:numId w:val="6"/>
-        </w:numPr>
-        <w:rPr>
-          <w:rFonts w:ascii="Calibri" w:hAnsi="Calibri" w:cs="Calibri"/>
-          <w:sz w:val="22"/>
-          <w:szCs w:val="22"/>
-        </w:rPr>
-      </w:pPr>
-      <w:r>
-        <w:rPr>
-          <w:rFonts w:ascii="Calibri" w:hAnsi="Calibri" w:cs="Calibri"/>
-          <w:sz w:val="22"/>
-          <w:szCs w:val="22"/>
-        </w:rPr>
-        <w:t>SQL-queries-image-</w:t>
-      </w:r>
-      <w:r>
-        <w:rPr>
-          <w:rFonts w:ascii="Calibri" w:hAnsi="Calibri" w:cs="Calibri"/>
-          <w:sz w:val="22"/>
-          <w:szCs w:val="22"/>
-        </w:rPr>
-        <w:t>6.jpg</w:t>
-      </w:r>
-    </w:p>
-    <w:p>
-      <w:pPr>
-        <w:numPr>
-          <w:ilvl w:val="0"/>
-          <w:numId w:val="6"/>
-        </w:numPr>
-        <w:rPr>
-          <w:rFonts w:ascii="Calibri" w:hAnsi="Calibri" w:cs="Calibri"/>
-          <w:sz w:val="22"/>
-          <w:szCs w:val="22"/>
-        </w:rPr>
-      </w:pPr>
-      <w:r>
-        <w:rPr>
-          <w:rFonts w:ascii="Calibri" w:hAnsi="Calibri" w:cs="Calibri"/>
-          <w:sz w:val="22"/>
-          <w:szCs w:val="22"/>
-        </w:rPr>
-        <w:t>SQL-queries-image-</w:t>
-      </w:r>
-      <w:r>
-        <w:rPr>
-          <w:rFonts w:ascii="Calibri" w:hAnsi="Calibri" w:cs="Calibri"/>
-          <w:sz w:val="22"/>
-          <w:szCs w:val="22"/>
-        </w:rPr>
-        <w:t>7.jpg</w:t>
-      </w:r>
-    </w:p>
-    <w:p>
-      <w:pPr>
-        <w:numPr>
-          <w:ilvl w:val="0"/>
-          <w:numId w:val="6"/>
-        </w:numPr>
-        <w:rPr>
-          <w:rFonts w:ascii="Calibri" w:hAnsi="Calibri" w:cs="Calibri"/>
-          <w:sz w:val="22"/>
-          <w:szCs w:val="22"/>
-        </w:rPr>
-      </w:pPr>
-      <w:r>
-        <w:rPr>
-          <w:rFonts w:ascii="Calibri" w:hAnsi="Calibri" w:cs="Calibri"/>
-          <w:sz w:val="22"/>
-          <w:szCs w:val="22"/>
-        </w:rPr>
-        <w:t>SQL-queries-image-</w:t>
-      </w:r>
-      <w:r>
-        <w:rPr>
-          <w:rFonts w:ascii="Calibri" w:hAnsi="Calibri" w:cs="Calibri"/>
-          <w:sz w:val="22"/>
-          <w:szCs w:val="22"/>
-        </w:rPr>
-        <w:t>8</w:t>
-      </w:r>
-      <w:r>
-        <w:rPr>
-          <w:rFonts w:ascii="Calibri" w:hAnsi="Calibri" w:cs="Calibri"/>
-          <w:sz w:val="22"/>
-          <w:szCs w:val="22"/>
-        </w:rPr>
-        <w:t>.jpg</w:t>
-      </w:r>
-    </w:p>
-    <w:p>
-      <w:pPr>
-        <w:numPr>
-          <w:ilvl w:val="0"/>
-          <w:numId w:val="6"/>
-        </w:numPr>
-        <w:rPr>
-          <w:rFonts w:ascii="Calibri" w:hAnsi="Calibri" w:cs="Calibri"/>
-          <w:sz w:val="22"/>
-          <w:szCs w:val="22"/>
-        </w:rPr>
-      </w:pPr>
-      <w:r>
-        <w:rPr>
-          <w:rFonts w:ascii="Calibri" w:hAnsi="Calibri" w:cs="Calibri"/>
-          <w:sz w:val="22"/>
-          <w:szCs w:val="22"/>
-        </w:rPr>
-        <w:t>SQL-queries-image-</w:t>
-      </w:r>
-      <w:r>
-        <w:rPr>
-          <w:rFonts w:ascii="Calibri" w:hAnsi="Calibri" w:cs="Calibri"/>
-          <w:sz w:val="22"/>
-          <w:szCs w:val="22"/>
-        </w:rPr>
-        <w:t>9.jpg</w:t>
-      </w:r>
-    </w:p>
-    <w:p>
-      <w:pPr>
-        <w:numPr>
-          <w:ilvl w:val="0"/>
-          <w:numId w:val="6"/>
-        </w:numPr>
-        <w:rPr>
-          <w:rFonts w:ascii="Calibri" w:hAnsi="Calibri" w:cs="Calibri"/>
-          <w:sz w:val="22"/>
-          <w:szCs w:val="22"/>
-        </w:rPr>
-      </w:pPr>
-      <w:r>
-        <w:rPr>
-          <w:rFonts w:ascii="Calibri" w:hAnsi="Calibri" w:cs="Calibri"/>
-          <w:sz w:val="22"/>
-          <w:szCs w:val="22"/>
-        </w:rPr>
-        <w:t>DermAI_Diagnostics_Project_Overview</w:t>
-      </w:r>
-      <w:r>
-        <w:rPr>
-          <w:rFonts w:ascii="Calibri" w:hAnsi="Calibri" w:cs="Calibri"/>
-          <w:sz w:val="22"/>
-          <w:szCs w:val="22"/>
-        </w:rPr>
-        <w:t>.docx</w:t>
       </w:r>
     </w:p>
     <w:p>

</xml_diff>